<commit_message>
feat: export dashboard data to feishu spreadsheet using lark-cli
</commit_message>
<xml_diff>
--- a/6月1日运营商业绩摘要.docx
+++ b/6月1日运营商业绩摘要.docx
@@ -33,7 +33,7 @@
           <w:szCs w:val="36"/>
           <w:lang w:eastAsia="zh-CN"/>
         </w:rPr>
-        <w:t>各家运营商2025年关键业绩摘要</w:t>
+        <w:t>各家运营商关键业绩摘要</w:t>
       </w:r>
       <w:r>
         <w:rPr>
@@ -136,7 +136,7 @@
           <w:szCs w:val="24"/>
           <w:lang w:eastAsia="zh-CN"/>
         </w:rPr>
-        <w:t>截至2026年3月26日，中国移动、中国电信、中国联通及中国铁塔2025财年业绩均已发布。现结合公开披露数据、业绩公告及券商研报，将各家运营商2025年关键业绩数据与资本市场反应摘要如下，供内部决策参考。</w:t>
+        <w:t>截至2026年6月1日，本报告基于系统最新公开信息监测结果自动生成。报告沿用参考模板版式，以结构化业绩基线数据为表格基础，并结合本轮爬取结果补充AI、算力、5G和资本开支相关动态；未在当前监测结果中取得新证据的部分会明确提示后续补充方向。</w:t>
       </w:r>
       <w:r>
         <w:rPr>
@@ -304,7 +304,7 @@
           <w:sz w:val="32"/>
           <w:lang w:eastAsia="zh-CN"/>
         </w:rPr>
-        <w:t>表：各家运营商2025年关键业绩数据汇总</w:t>
+        <w:t>表：各家运营商关键业绩数据汇总（结构化基线）</w:t>
       </w:r>
       <w:r>
         <w:rPr>
@@ -1016,7 +1016,7 @@
           <w:szCs w:val="32"/>
           <w:lang w:eastAsia="zh-CN"/>
         </w:rPr>
-        <w:t>中国移动（业绩说明会3月26日）关键摘要</w:t>
+        <w:t>中国移动关键摘要</w:t>
       </w:r>
       <w:r>
         <w:rPr>
@@ -1097,7 +1097,7 @@
           <w:szCs w:val="24"/>
           <w:lang w:eastAsia="zh-CN"/>
         </w:rPr>
-        <w:t>派息稳增：全年派息每股5.27港元（+3.5%），派息率75%，并指引2026年派息率稳中有升，持续增强股东回报。</w:t>
+        <w:t>核心业绩：营业收入为10502 +0.9%，主营业务收入为8955 +0.7%，EBITDA为3389 +1.6%，归母净利润为1371 -0.9%，净利率为13.1%。</w:t>
       </w:r>
       <w:r>
         <w:rPr>
@@ -1232,7 +1232,7 @@
           <w:szCs w:val="24"/>
           <w:lang w:eastAsia="zh-CN"/>
         </w:rPr>
-        <w:t>资本开支转向算力：2026年资本开支预计再降9.5%至1,366亿元，其中通信相关投资减少20%，算力投资增长62%，AI投资增长20%，结构加速向“新质生产力”倾斜。公司将把算力服务作为高质量发展的重要增长极，目标是到“十五五”期末实现收入翻番。与此同时，该公司将加快AIDC、算力、Token能力提升。</w:t>
+        <w:t>资本开支：2025年资本开支为1509 -8.0%，2026年计划为1366；后续需持续关注投资结构是否继续向算力、AI和网络能力升级倾斜。</w:t>
       </w:r>
       <w:r>
         <w:rPr>
@@ -1539,7 +1539,7 @@
           <w:szCs w:val="24"/>
           <w:lang w:eastAsia="zh-CN"/>
         </w:rPr>
-        <w:t>券商观点：维持原有评级，目标价高于现价。</w:t>
+        <w:t>用户与网络：移动用户数为10.05，5G网络用户数为6.42，5G网络渗透率为63.9%。</w:t>
       </w:r>
     </w:p>
     <w:p>
@@ -1574,7 +1574,7 @@
           <w:szCs w:val="24"/>
           <w:lang w:eastAsia="zh-CN"/>
         </w:rPr>
-        <w:t>里昂发表报告指出，业绩虽偏弱但优于同业，公司提供7%股息率为同业最高，维持“跑赢大市”评级及目标价86港元。</w:t>
+        <w:t>本轮监测补充：截至2026年6月1日，当前爬取结果中未取得新的可复核补充片段，需补充该公司的财报公告、业绩演示材料或交易所披露链接。</w:t>
       </w:r>
       <w:r>
         <w:rPr>
@@ -1653,7 +1653,7 @@
           <w:szCs w:val="24"/>
           <w:lang w:eastAsia="zh-CN"/>
         </w:rPr>
-        <w:t>花旗指出，收入略低于预期但EBITDA基本符合，看好派息率稳步提升，维持“买入”，目标价105.1港元。</w:t>
+        <w:t>后续关注：建议按同一口径持续跟踪派息政策、资本开支变化、AI/算力投入、5G用户渗透和资本市场反馈，避免仅看单一收入指标。</w:t>
       </w:r>
       <w:r>
         <w:rPr>
@@ -1732,7 +1732,7 @@
           <w:szCs w:val="24"/>
           <w:lang w:eastAsia="zh-CN"/>
         </w:rPr>
-        <w:t>摩根士丹利：服务收入符合预期，EBITDA略低于预期，维持“与大市同步”，目标价85港元。</w:t>
+        <w:t>中国电信关键摘要</w:t>
       </w:r>
       <w:r>
         <w:rPr>
@@ -1812,7 +1812,7 @@
           <w:szCs w:val="24"/>
           <w:lang w:eastAsia="zh-CN"/>
         </w:rPr>
-        <w:t>市场反应：业绩公布后股价微升（截止3月27日16:00，股价为78.05港元，上涨0.71%），市场关注其严格的成本控制及向算力/AI的转型成效。</w:t>
+        <w:t>核心业绩：营业收入为5296 +0.03%，主营业务收入为4854 +0.7%，EBITDA为1439 +2.1%，归母净利润为332 +0.5%，净利率为6.3%。</w:t>
       </w:r>
       <w:r>
         <w:rPr>
@@ -2063,7 +2063,7 @@
           <w:szCs w:val="32"/>
           <w:lang w:eastAsia="zh-CN"/>
         </w:rPr>
-        <w:t>中国电信（业绩说明会3月24日）关键摘要</w:t>
+        <w:t>资本开支：2025年资本开支为804 -14.0%，2026年计划为730；后续需持续关注投资结构是否继续向算力、AI和网络能力升级倾斜。</w:t>
       </w:r>
       <w:r>
         <w:rPr>
@@ -2144,7 +2144,7 @@
           <w:szCs w:val="24"/>
           <w:lang w:eastAsia="zh-CN"/>
         </w:rPr>
-        <w:t>派息：全年派息率75%，每股0.2720元（+4.7%）。</w:t>
+        <w:t>用户与网络：移动用户数为4.39，5G网络用户数为3.02，5G网络渗透率为68.8%。</w:t>
       </w:r>
       <w:r>
         <w:rPr>
@@ -2257,7 +2257,7 @@
           <w:szCs w:val="24"/>
           <w:lang w:eastAsia="zh-CN"/>
         </w:rPr>
-        <w:t>资本开支：2026年资本开支降至730亿元（-9.2%），但算力基础设施投资同比增长26%，达255亿元，占总开支比重升至35%。</w:t>
+        <w:t>本轮监测补充：截至2026年6月1日，当前爬取结果中未取得新的可复核补充片段，需补充该公司的财报公告、业绩演示材料或交易所披露链接。</w:t>
       </w:r>
       <w:r>
         <w:rPr>
@@ -2449,7 +2449,7 @@
           <w:szCs w:val="24"/>
           <w:lang w:eastAsia="zh-CN"/>
         </w:rPr>
-        <w:t>战略升级：全面拥抱AI，战略从“云改数转”升级为“云改数转智惠”，以打造领先的AI服务商为目标，以Token服务为经营主线。</w:t>
+        <w:t>后续关注：建议按同一口径持续跟踪派息政策、资本开支变化、AI/算力投入、5G用户渗透和资本市场反馈，避免仅看单一收入指标。</w:t>
       </w:r>
       <w:r>
         <w:rPr>
@@ -2563,7 +2563,7 @@
           <w:szCs w:val="24"/>
           <w:lang w:eastAsia="zh-CN"/>
         </w:rPr>
-        <w:t>券商观点：基本维持原有评级。</w:t>
+        <w:t>中国联通关键摘要</w:t>
       </w:r>
     </w:p>
     <w:p>
@@ -2598,7 +2598,7 @@
           <w:szCs w:val="24"/>
           <w:lang w:eastAsia="zh-CN"/>
         </w:rPr>
-        <w:t>中银国际：盈利略低于预期，但看好Token、智算中心及云安全驱动增长，重申“买入”，目标价7.85港元。</w:t>
+        <w:t>核心业绩：营业收入为3922 +0.7%，主营业务收入为3477 +0.5%，EBITDA为994 +0%，归母净利润为91 +1.1%，净利率为2.3%。</w:t>
       </w:r>
       <w:r>
         <w:rPr>
@@ -2725,7 +2725,7 @@
           <w:szCs w:val="24"/>
           <w:lang w:eastAsia="zh-CN"/>
         </w:rPr>
-        <w:t>摩根士丹利：去年第四季度业绩逊预期，但管理层对2026年收入、EBITDA及利润增长给出正面指引，维持“与大市同步”，目标价5.5港元。</w:t>
+        <w:t>资本开支：2025年资本开支为542 -11.7%，2026年计划为500；后续需持续关注投资结构是否继续向算力、AI和网络能力升级倾斜。</w:t>
       </w:r>
       <w:r>
         <w:rPr>
@@ -2827,7 +2827,7 @@
           <w:szCs w:val="24"/>
           <w:lang w:eastAsia="zh-CN"/>
         </w:rPr>
-        <w:t>市场反应：业绩说明会当日收盘价4.89港元，3月27日收盘价为4.86港元，股价整体维持稳定。</w:t>
+        <w:t>用户与网络：移动用户数为3.57，5G网络用户数为2.32，5G网络渗透率为65.0%。</w:t>
       </w:r>
       <w:r>
         <w:rPr>
@@ -2988,7 +2988,7 @@
           <w:szCs w:val="32"/>
           <w:lang w:eastAsia="zh-CN"/>
         </w:rPr>
-        <w:t>中国联通（业绩说明会3月19日）关键摘要</w:t>
+        <w:t>本轮监测补充：截至2026年6月1日，当前爬取结果中未取得新的可复核补充片段，需补充该公司的财报公告、业绩演示材料或交易所披露链接。</w:t>
       </w:r>
       <w:r>
         <w:rPr>
@@ -3069,7 +3069,7 @@
           <w:szCs w:val="24"/>
           <w:lang w:eastAsia="zh-CN"/>
         </w:rPr>
-        <w:t>派息：派发末期股息每股人民币0.0523元，连同已派发的中期股息每股人民币0.1112元，2025年股息合计每股人民币0.1635元，同比提升3.5%。</w:t>
+        <w:t>后续关注：建议按同一口径持续跟踪派息政策、资本开支变化、AI/算力投入、5G用户渗透和资本市场反馈，避免仅看单一收入指标。</w:t>
       </w:r>
       <w:r>
         <w:rPr>
@@ -3225,7 +3225,7 @@
           <w:szCs w:val="24"/>
           <w:lang w:eastAsia="zh-CN"/>
         </w:rPr>
-        <w:t>2025年，中国联通抢抓新一轮科技和产业创新机遇，落实“人工智能+”行动，战略性新兴产业收入占比超过86%，算力业务收入占比超过15%、较上年提升1.1个百分点，人工智能业务收入同比增长超过140%。2026年资本开支预计在500亿元左右，其中算力投资占比超过35%。</w:t>
+        <w:t>中国铁塔关键摘要</w:t>
       </w:r>
       <w:r>
         <w:rPr>
@@ -3495,7 +3495,7 @@
           <w:szCs w:val="24"/>
           <w:lang w:eastAsia="zh-CN"/>
         </w:rPr>
-        <w:t>中国联通董事长董昕在业绩发布会上表示，“中国联通30余年的发展，从弱到强，从小到大，始终有明确、清晰的战略，并且聚焦战略确立非常明确的工作措施和赛道，在此基础上坚决地落实才有了今天的成绩。联通的目标就是，健康地、鲜活地活着。”</w:t>
+        <w:t>核心业绩：营业收入为1004 +2.7%，主营业务收入为运营商业务收入 847.25亿元 +0.7%，EBITDA为658.14 -1.1%，归母净利润为116 +8.4%，净利率为11.6%。</w:t>
       </w:r>
       <w:r>
         <w:rPr>
@@ -3554,7 +3554,7 @@
           <w:szCs w:val="24"/>
           <w:lang w:eastAsia="zh-CN"/>
         </w:rPr>
-        <w:t>券商观点：业绩逊于预期，市场信心削弱。</w:t>
+        <w:t>资本开支：2025年资本开支为295 -7.7%，2026年计划为未披露；后续需持续关注投资结构是否继续向算力、AI和网络能力升级倾斜。</w:t>
       </w:r>
     </w:p>
     <w:p>
@@ -3589,7 +3589,7 @@
           <w:szCs w:val="24"/>
           <w:lang w:eastAsia="zh-CN"/>
         </w:rPr>
-        <w:t>晨星：将公允价值预测从10.6港元下调9%至9.6港元，并维持“无护城河”评级，直指其资本回报率持续低于资本成本，核心业务盈利能力羸弱。</w:t>
+        <w:t>用户与网络：移动用户数为不涉及，5G网络用户数为不涉及，5G网络渗透率为不涉及。</w:t>
       </w:r>
       <w:r>
         <w:rPr>
@@ -3690,7 +3690,7 @@
           <w:szCs w:val="24"/>
           <w:lang w:eastAsia="zh-CN"/>
         </w:rPr>
-        <w:t>瑞银：予“中性”评级，目标价8.1港元。公司上季业绩、收入同比、EBITDA同比与派息率均逊于预期，并表示由于联通业绩未达预期，料市场将作出负面反应。市场忧虑增值税（VAT）继续令公司净利润受压，而派息比率逊于预期，更进一步削弱市场对其股息前景的信心。</w:t>
+        <w:t>本轮监测补充：截至2026年6月1日，当前爬取结果中未取得新的可复核补充片段，需补充该公司的财报公告、业绩演示材料或交易所披露链接。</w:t>
       </w:r>
       <w:r>
         <w:rPr>
@@ -3884,593 +3884,209 @@
           <w:szCs w:val="24"/>
           <w:lang w:eastAsia="zh-CN"/>
         </w:rPr>
-        <w:t>市场反应：业绩公布后股价持续下降，3月27日收盘价为7.03港元，相较于业绩说明会3月19日当日收盘价7.54港元下滑6.8%。</w:t>
-      </w:r>
-      <w:r>
-        <w:rPr>
-          <w:rFonts w:ascii="FangSong" w:eastAsia="FangSong" w:hAnsi="FangSong" w:cs="Times New Roman" w:hint="eastAsia"/>
-          <w:bCs/>
-          <w:snapToGrid w:val="0"/>
-          <w:kern w:val="24"/>
-          <w:sz w:val="28"/>
-          <w:szCs w:val="24"/>
-          <w:lang w:eastAsia="zh-CN"/>
-        </w:rPr>
-      </w:r>
-      <w:r>
-        <w:rPr>
-          <w:rFonts w:ascii="FangSong" w:eastAsia="FangSong" w:hAnsi="FangSong" w:cs="Times New Roman" w:hint="eastAsia"/>
-          <w:bCs/>
-          <w:snapToGrid w:val="0"/>
-          <w:kern w:val="24"/>
-          <w:sz w:val="28"/>
-          <w:szCs w:val="24"/>
-          <w:lang w:eastAsia="zh-CN"/>
-        </w:rPr>
-      </w:r>
-      <w:r>
-        <w:rPr>
-          <w:rFonts w:ascii="FangSong" w:eastAsia="FangSong" w:hAnsi="FangSong" w:cs="Times New Roman" w:hint="eastAsia"/>
-          <w:bCs/>
-          <w:snapToGrid w:val="0"/>
-          <w:kern w:val="24"/>
-          <w:sz w:val="28"/>
-          <w:szCs w:val="24"/>
-          <w:lang w:eastAsia="zh-CN"/>
-        </w:rPr>
-      </w:r>
-      <w:r>
-        <w:rPr>
-          <w:rFonts w:ascii="FangSong" w:eastAsia="FangSong" w:hAnsi="FangSong" w:cs="Times New Roman" w:hint="eastAsia"/>
-          <w:bCs/>
-          <w:snapToGrid w:val="0"/>
-          <w:kern w:val="24"/>
-          <w:sz w:val="28"/>
-          <w:szCs w:val="24"/>
-          <w:lang w:eastAsia="zh-CN"/>
-        </w:rPr>
-      </w:r>
-      <w:r>
-        <w:rPr>
-          <w:rFonts w:ascii="FangSong" w:eastAsia="FangSong" w:hAnsi="FangSong" w:cs="Times New Roman"/>
-          <w:bCs/>
-          <w:snapToGrid w:val="0"/>
-          <w:kern w:val="24"/>
-          <w:sz w:val="28"/>
-          <w:szCs w:val="24"/>
-          <w:lang w:eastAsia="zh-CN"/>
-        </w:rPr>
-      </w:r>
-      <w:r>
-        <w:rPr>
-          <w:rFonts w:ascii="FangSong" w:eastAsia="FangSong" w:hAnsi="FangSong" w:cs="Times New Roman" w:hint="eastAsia"/>
-          <w:bCs/>
-          <w:snapToGrid w:val="0"/>
-          <w:kern w:val="24"/>
-          <w:sz w:val="28"/>
-          <w:szCs w:val="24"/>
-          <w:lang w:eastAsia="zh-CN"/>
-        </w:rPr>
-      </w:r>
-      <w:r>
-        <w:rPr>
-          <w:rFonts w:ascii="FangSong" w:eastAsia="FangSong" w:hAnsi="FangSong" w:cs="Times New Roman" w:hint="eastAsia"/>
-          <w:bCs/>
-          <w:snapToGrid w:val="0"/>
-          <w:kern w:val="24"/>
-          <w:sz w:val="28"/>
-          <w:szCs w:val="24"/>
-          <w:lang w:eastAsia="zh-CN"/>
-        </w:rPr>
-      </w:r>
-      <w:r>
-        <w:rPr>
-          <w:rFonts w:ascii="FangSong" w:eastAsia="FangSong" w:hAnsi="FangSong" w:cs="Times New Roman"/>
-          <w:bCs/>
-          <w:snapToGrid w:val="0"/>
-          <w:kern w:val="24"/>
-          <w:sz w:val="28"/>
-          <w:szCs w:val="24"/>
-          <w:lang w:eastAsia="zh-CN"/>
-        </w:rPr>
-      </w:r>
-      <w:r>
-        <w:rPr>
-          <w:rFonts w:ascii="FangSong" w:eastAsia="FangSong" w:hAnsi="FangSong" w:cs="Times New Roman" w:hint="eastAsia"/>
-          <w:bCs/>
-          <w:snapToGrid w:val="0"/>
-          <w:kern w:val="24"/>
-          <w:sz w:val="28"/>
-          <w:szCs w:val="24"/>
-          <w:lang w:eastAsia="zh-CN"/>
-        </w:rPr>
-      </w:r>
-      <w:r>
-        <w:rPr>
-          <w:rFonts w:ascii="FangSong" w:eastAsia="FangSong" w:hAnsi="FangSong" w:cs="Times New Roman" w:hint="eastAsia"/>
-          <w:bCs/>
-          <w:snapToGrid w:val="0"/>
-          <w:kern w:val="24"/>
-          <w:sz w:val="28"/>
-          <w:szCs w:val="24"/>
-          <w:lang w:eastAsia="zh-CN"/>
-        </w:rPr>
-      </w:r>
-      <w:r>
-        <w:rPr>
-          <w:rFonts w:ascii="FangSong" w:eastAsia="FangSong" w:hAnsi="FangSong" w:cs="Times New Roman" w:hint="eastAsia"/>
-          <w:bCs/>
-          <w:snapToGrid w:val="0"/>
-          <w:kern w:val="24"/>
-          <w:sz w:val="28"/>
-          <w:szCs w:val="24"/>
-          <w:lang w:eastAsia="zh-CN"/>
-        </w:rPr>
-      </w:r>
-      <w:r>
-        <w:rPr>
-          <w:rFonts w:ascii="FangSong" w:eastAsia="FangSong" w:hAnsi="FangSong" w:cs="Times New Roman" w:hint="eastAsia"/>
-          <w:bCs/>
-          <w:snapToGrid w:val="0"/>
-          <w:kern w:val="24"/>
-          <w:sz w:val="28"/>
-          <w:szCs w:val="24"/>
-          <w:lang w:eastAsia="zh-CN"/>
-        </w:rPr>
-      </w:r>
-      <w:r>
-        <w:rPr>
-          <w:rFonts w:ascii="FangSong" w:eastAsia="FangSong" w:hAnsi="FangSong" w:cs="Times New Roman"/>
-          <w:bCs/>
-          <w:snapToGrid w:val="0"/>
-          <w:kern w:val="24"/>
-          <w:sz w:val="28"/>
-          <w:szCs w:val="24"/>
-          <w:lang w:eastAsia="zh-CN"/>
-        </w:rPr>
-      </w:r>
-      <w:r>
-        <w:rPr>
-          <w:rFonts w:ascii="FangSong" w:eastAsia="FangSong" w:hAnsi="FangSong" w:cs="Times New Roman" w:hint="eastAsia"/>
-          <w:bCs/>
-          <w:snapToGrid w:val="0"/>
-          <w:kern w:val="24"/>
-          <w:sz w:val="28"/>
-          <w:szCs w:val="24"/>
-          <w:lang w:eastAsia="zh-CN"/>
-        </w:rPr>
-      </w:r>
-      <w:r>
-        <w:rPr>
-          <w:rFonts w:ascii="FangSong" w:eastAsia="FangSong" w:hAnsi="FangSong" w:cs="Times New Roman" w:hint="eastAsia"/>
-          <w:bCs/>
-          <w:snapToGrid w:val="0"/>
-          <w:kern w:val="24"/>
-          <w:sz w:val="28"/>
-          <w:szCs w:val="24"/>
-          <w:lang w:eastAsia="zh-CN"/>
-        </w:rPr>
-      </w:r>
-      <w:r>
-        <w:rPr>
-          <w:rFonts w:ascii="FangSong" w:eastAsia="FangSong" w:hAnsi="FangSong" w:cs="Times New Roman"/>
-          <w:bCs/>
-          <w:snapToGrid w:val="0"/>
-          <w:kern w:val="24"/>
-          <w:sz w:val="28"/>
-          <w:szCs w:val="24"/>
-          <w:lang w:eastAsia="zh-CN"/>
-        </w:rPr>
-      </w:r>
-      <w:r>
-        <w:rPr>
-          <w:rFonts w:ascii="FangSong" w:eastAsia="FangSong" w:hAnsi="FangSong" w:cs="Times New Roman" w:hint="eastAsia"/>
-          <w:bCs/>
-          <w:snapToGrid w:val="0"/>
-          <w:kern w:val="24"/>
-          <w:sz w:val="28"/>
-          <w:szCs w:val="24"/>
-          <w:lang w:eastAsia="zh-CN"/>
-        </w:rPr>
-      </w:r>
-      <w:r>
-        <w:rPr>
-          <w:rFonts w:ascii="FangSong" w:eastAsia="FangSong" w:hAnsi="FangSong" w:cs="Times New Roman" w:hint="eastAsia"/>
-          <w:bCs/>
-          <w:snapToGrid w:val="0"/>
-          <w:kern w:val="24"/>
-          <w:sz w:val="28"/>
-          <w:szCs w:val="24"/>
-          <w:lang w:eastAsia="zh-CN"/>
-        </w:rPr>
-      </w:r>
-      <w:r>
-        <w:rPr>
-          <w:rFonts w:ascii="FangSong" w:eastAsia="FangSong" w:hAnsi="FangSong" w:cs="Times New Roman"/>
-          <w:bCs/>
-          <w:snapToGrid w:val="0"/>
-          <w:kern w:val="24"/>
-          <w:sz w:val="28"/>
-          <w:szCs w:val="24"/>
-          <w:lang w:eastAsia="zh-CN"/>
-        </w:rPr>
-      </w:r>
-      <w:r>
-        <w:rPr>
-          <w:rFonts w:ascii="FangSong" w:eastAsia="FangSong" w:hAnsi="FangSong" w:cs="Times New Roman" w:hint="eastAsia"/>
-          <w:bCs/>
-          <w:snapToGrid w:val="0"/>
-          <w:kern w:val="24"/>
-          <w:sz w:val="28"/>
-          <w:szCs w:val="24"/>
-          <w:lang w:eastAsia="zh-CN"/>
-        </w:rPr>
-      </w:r>
-    </w:p>
-    <w:p>
-      <w:pPr>
-        <w:pStyle w:val="af"/>
-        <w:numPr>
-          <w:ilvl w:val="0"/>
-          <w:numId w:val="1"/>
-        </w:numPr>
-        <w:spacing w:before="180" w:line="312" w:lineRule="auto"/>
-        <w:ind w:leftChars="0"/>
-        <w:jc w:val="both"/>
-        <w:rPr>
-          <w:rFonts w:ascii="Times New Roman" w:eastAsia="FangSong_GB2312" w:hAnsi="Times New Roman" w:cs="Times New Roman"/>
-          <w:b/>
-          <w:sz w:val="32"/>
-          <w:szCs w:val="32"/>
-          <w:lang w:eastAsia="zh-CN"/>
-        </w:rPr>
-      </w:pPr>
-      <w:r>
-        <w:rPr>
-          <w:rFonts w:ascii="Times New Roman" w:eastAsia="FangSong_GB2312" w:hAnsi="Times New Roman" w:cs="Times New Roman" w:hint="eastAsia"/>
-          <w:b/>
-          <w:sz w:val="32"/>
-          <w:szCs w:val="32"/>
-          <w:lang w:eastAsia="zh-CN"/>
-        </w:rPr>
-        <w:t>中国铁塔（业绩说明会3月18日）关键摘要</w:t>
-      </w:r>
-      <w:r>
-        <w:rPr>
-          <w:rFonts w:ascii="Times New Roman" w:eastAsia="FangSong_GB2312" w:hAnsi="Times New Roman" w:cs="Times New Roman" w:hint="eastAsia"/>
-          <w:b/>
-          <w:sz w:val="32"/>
-          <w:szCs w:val="32"/>
-          <w:lang w:eastAsia="zh-CN"/>
-        </w:rPr>
-      </w:r>
-      <w:r>
-        <w:rPr>
-          <w:rFonts w:ascii="Times New Roman" w:eastAsia="FangSong_GB2312" w:hAnsi="Times New Roman" w:cs="Times New Roman" w:hint="eastAsia"/>
-          <w:b/>
-          <w:sz w:val="32"/>
-          <w:szCs w:val="32"/>
-          <w:lang w:eastAsia="zh-CN"/>
-        </w:rPr>
-      </w:r>
-      <w:r>
-        <w:rPr>
-          <w:rFonts w:ascii="Times New Roman" w:eastAsia="FangSong_GB2312" w:hAnsi="Times New Roman" w:cs="Times New Roman" w:hint="eastAsia"/>
-          <w:b/>
-          <w:sz w:val="32"/>
-          <w:szCs w:val="32"/>
-          <w:lang w:eastAsia="zh-CN"/>
-        </w:rPr>
-      </w:r>
-      <w:r>
-        <w:rPr>
-          <w:rFonts w:ascii="Times New Roman" w:eastAsia="FangSong_GB2312" w:hAnsi="Times New Roman" w:cs="Times New Roman"/>
-          <w:b/>
-          <w:sz w:val="32"/>
-          <w:szCs w:val="32"/>
-          <w:lang w:eastAsia="zh-CN"/>
-        </w:rPr>
-      </w:r>
-      <w:r>
-        <w:rPr>
-          <w:rFonts w:ascii="Times New Roman" w:eastAsia="FangSong_GB2312" w:hAnsi="Times New Roman" w:cs="Times New Roman" w:hint="eastAsia"/>
-          <w:b/>
-          <w:sz w:val="32"/>
-          <w:szCs w:val="32"/>
-          <w:lang w:eastAsia="zh-CN"/>
-        </w:rPr>
-      </w:r>
-    </w:p>
-    <w:p>
-      <w:pPr>
-        <w:pStyle w:val="af"/>
-        <w:numPr>
-          <w:ilvl w:val="0"/>
-          <w:numId w:val="7"/>
-        </w:numPr>
-        <w:snapToGrid w:val="0"/>
-        <w:spacing w:before="180" w:line="312" w:lineRule="auto"/>
-        <w:ind w:leftChars="0"/>
-        <w:jc w:val="both"/>
-        <w:outlineLvl w:val="3"/>
-        <w:rPr>
-          <w:rFonts w:ascii="FangSong" w:eastAsia="FangSong" w:hAnsi="FangSong" w:cs="Times New Roman"/>
-          <w:bCs/>
-          <w:snapToGrid w:val="0"/>
-          <w:kern w:val="24"/>
-          <w:sz w:val="28"/>
-          <w:szCs w:val="24"/>
-          <w:lang w:eastAsia="zh-CN"/>
-        </w:rPr>
-      </w:pPr>
-      <w:r>
-        <w:rPr>
-          <w:rFonts w:ascii="FangSong" w:eastAsia="FangSong" w:hAnsi="FangSong" w:cs="Times New Roman" w:hint="eastAsia"/>
-          <w:b/>
-          <w:bCs/>
-          <w:snapToGrid w:val="0"/>
-          <w:kern w:val="24"/>
-          <w:sz w:val="28"/>
-          <w:szCs w:val="24"/>
-          <w:lang w:eastAsia="zh-CN"/>
-        </w:rPr>
-        <w:t>派息：派发末期股息为每股0.32539元（税前），连同已派发的中期股息，全年股息合计为每股0.45789元（税前），全年可分配利润派息比率为77%。</w:t>
-      </w:r>
-      <w:r>
-        <w:rPr>
-          <w:rFonts w:ascii="FangSong" w:eastAsia="FangSong" w:hAnsi="FangSong" w:cs="Times New Roman" w:hint="eastAsia"/>
-          <w:bCs/>
-          <w:snapToGrid w:val="0"/>
-          <w:kern w:val="24"/>
-          <w:sz w:val="28"/>
-          <w:szCs w:val="24"/>
-          <w:lang w:eastAsia="zh-CN"/>
-        </w:rPr>
-      </w:r>
-      <w:r>
-        <w:rPr>
-          <w:rFonts w:ascii="FangSong" w:eastAsia="FangSong" w:hAnsi="FangSong" w:cs="Times New Roman"/>
-          <w:bCs/>
-          <w:snapToGrid w:val="0"/>
-          <w:kern w:val="24"/>
-          <w:sz w:val="28"/>
-          <w:szCs w:val="24"/>
-          <w:lang w:eastAsia="zh-CN"/>
-        </w:rPr>
-      </w:r>
-      <w:r>
-        <w:rPr>
-          <w:rFonts w:ascii="FangSong" w:eastAsia="FangSong" w:hAnsi="FangSong" w:cs="Times New Roman" w:hint="eastAsia"/>
-          <w:bCs/>
-          <w:snapToGrid w:val="0"/>
-          <w:kern w:val="24"/>
-          <w:sz w:val="28"/>
-          <w:szCs w:val="24"/>
-          <w:lang w:eastAsia="zh-CN"/>
-        </w:rPr>
-      </w:r>
-      <w:r>
-        <w:rPr>
-          <w:rFonts w:ascii="FangSong" w:eastAsia="FangSong" w:hAnsi="FangSong" w:cs="Times New Roman"/>
-          <w:bCs/>
-          <w:snapToGrid w:val="0"/>
-          <w:kern w:val="24"/>
-          <w:sz w:val="28"/>
-          <w:szCs w:val="24"/>
-          <w:lang w:eastAsia="zh-CN"/>
-        </w:rPr>
-      </w:r>
-      <w:r>
-        <w:rPr>
-          <w:rFonts w:ascii="FangSong" w:eastAsia="FangSong" w:hAnsi="FangSong" w:cs="Times New Roman" w:hint="eastAsia"/>
-          <w:bCs/>
-          <w:snapToGrid w:val="0"/>
-          <w:kern w:val="24"/>
-          <w:sz w:val="28"/>
-          <w:szCs w:val="24"/>
-          <w:lang w:eastAsia="zh-CN"/>
-        </w:rPr>
-      </w:r>
-      <w:r>
-        <w:rPr>
-          <w:rFonts w:ascii="FangSong" w:eastAsia="FangSong" w:hAnsi="FangSong" w:cs="Times New Roman"/>
-          <w:bCs/>
-          <w:snapToGrid w:val="0"/>
-          <w:kern w:val="24"/>
-          <w:sz w:val="28"/>
-          <w:szCs w:val="24"/>
-          <w:lang w:eastAsia="zh-CN"/>
-        </w:rPr>
-      </w:r>
-      <w:r>
-        <w:rPr>
-          <w:rFonts w:ascii="FangSong" w:eastAsia="FangSong" w:hAnsi="FangSong" w:cs="Times New Roman" w:hint="eastAsia"/>
-          <w:bCs/>
-          <w:snapToGrid w:val="0"/>
-          <w:kern w:val="24"/>
-          <w:sz w:val="28"/>
-          <w:szCs w:val="24"/>
-          <w:lang w:eastAsia="zh-CN"/>
-        </w:rPr>
-      </w:r>
-    </w:p>
-    <w:p>
-      <w:pPr>
-        <w:pStyle w:val="af"/>
-        <w:numPr>
-          <w:ilvl w:val="0"/>
-          <w:numId w:val="7"/>
-        </w:numPr>
-        <w:snapToGrid w:val="0"/>
-        <w:spacing w:before="180" w:line="312" w:lineRule="auto"/>
-        <w:ind w:leftChars="0"/>
-        <w:jc w:val="both"/>
-        <w:outlineLvl w:val="3"/>
-        <w:rPr>
-          <w:rFonts w:ascii="FangSong" w:eastAsia="FangSong" w:hAnsi="FangSong" w:cs="Times New Roman"/>
-          <w:bCs/>
-          <w:snapToGrid w:val="0"/>
-          <w:kern w:val="24"/>
-          <w:sz w:val="28"/>
-          <w:szCs w:val="24"/>
-          <w:lang w:eastAsia="zh-CN"/>
-        </w:rPr>
-      </w:pPr>
-      <w:proofErr w:type="gramStart"/>
-      <w:r>
-        <w:rPr>
-          <w:rFonts w:ascii="FangSong" w:eastAsia="FangSong" w:hAnsi="FangSong" w:cs="Times New Roman" w:hint="eastAsia"/>
-          <w:bCs/>
-          <w:snapToGrid w:val="0"/>
-          <w:kern w:val="24"/>
-          <w:sz w:val="28"/>
-          <w:szCs w:val="24"/>
-          <w:lang w:eastAsia="zh-CN"/>
-        </w:rPr>
-        <w:t>财报显示，中国铁塔深化“一体两翼”战略，即以面向通信行业的运营商业务为“一体”，以面向社会的智联业务和能源业务为“两翼”。营业收入保持稳定增长，2025年公司实现营业收入1004.11亿元，首次突破1000亿元大关，盈利能力持续增强，财务状况保持稳健。</w:t>
-      </w:r>
-      <w:proofErr w:type="gramEnd"/>
-      <w:r>
-        <w:rPr>
-          <w:rFonts w:ascii="FangSong" w:eastAsia="FangSong" w:hAnsi="FangSong" w:cs="Times New Roman" w:hint="eastAsia"/>
-          <w:bCs/>
-          <w:snapToGrid w:val="0"/>
-          <w:kern w:val="24"/>
-          <w:sz w:val="28"/>
-          <w:szCs w:val="24"/>
-          <w:lang w:eastAsia="zh-CN"/>
-        </w:rPr>
-      </w:r>
-      <w:proofErr w:type="gramStart"/>
-      <w:r>
-        <w:rPr>
-          <w:rFonts w:ascii="FangSong" w:eastAsia="FangSong" w:hAnsi="FangSong" w:cs="Times New Roman" w:hint="eastAsia"/>
-          <w:bCs/>
-          <w:snapToGrid w:val="0"/>
-          <w:kern w:val="24"/>
-          <w:sz w:val="28"/>
-          <w:szCs w:val="24"/>
-          <w:lang w:eastAsia="zh-CN"/>
-        </w:rPr>
-      </w:r>
-      <w:proofErr w:type="gramEnd"/>
-      <w:r>
-        <w:rPr>
-          <w:rFonts w:ascii="FangSong" w:eastAsia="FangSong" w:hAnsi="FangSong" w:cs="Times New Roman" w:hint="eastAsia"/>
-          <w:bCs/>
-          <w:snapToGrid w:val="0"/>
-          <w:kern w:val="24"/>
-          <w:sz w:val="28"/>
-          <w:szCs w:val="24"/>
-          <w:lang w:eastAsia="zh-CN"/>
-        </w:rPr>
-      </w:r>
-      <w:r>
-        <w:rPr>
-          <w:rFonts w:ascii="FangSong" w:eastAsia="FangSong" w:hAnsi="FangSong" w:cs="Times New Roman" w:hint="eastAsia"/>
-          <w:bCs/>
-          <w:snapToGrid w:val="0"/>
-          <w:kern w:val="24"/>
-          <w:sz w:val="28"/>
-          <w:szCs w:val="24"/>
-          <w:lang w:eastAsia="zh-CN"/>
-        </w:rPr>
-      </w:r>
-      <w:r>
-        <w:rPr>
-          <w:rFonts w:ascii="FangSong" w:eastAsia="FangSong" w:hAnsi="FangSong" w:cs="Times New Roman"/>
-          <w:bCs/>
-          <w:snapToGrid w:val="0"/>
-          <w:kern w:val="24"/>
-          <w:sz w:val="28"/>
-          <w:szCs w:val="24"/>
-          <w:lang w:eastAsia="zh-CN"/>
-        </w:rPr>
-      </w:r>
-      <w:r>
-        <w:rPr>
-          <w:rFonts w:ascii="FangSong" w:eastAsia="FangSong" w:hAnsi="FangSong" w:cs="Times New Roman" w:hint="eastAsia"/>
-          <w:bCs/>
-          <w:snapToGrid w:val="0"/>
-          <w:kern w:val="24"/>
-          <w:sz w:val="28"/>
-          <w:szCs w:val="24"/>
-          <w:lang w:eastAsia="zh-CN"/>
-        </w:rPr>
-      </w:r>
-      <w:r>
-        <w:rPr>
-          <w:rFonts w:ascii="FangSong" w:eastAsia="FangSong" w:hAnsi="FangSong" w:cs="Times New Roman" w:hint="eastAsia"/>
-          <w:bCs/>
-          <w:snapToGrid w:val="0"/>
-          <w:kern w:val="24"/>
-          <w:sz w:val="28"/>
-          <w:szCs w:val="24"/>
-          <w:lang w:eastAsia="zh-CN"/>
-        </w:rPr>
-      </w:r>
-      <w:r>
-        <w:rPr>
-          <w:rFonts w:ascii="FangSong" w:eastAsia="FangSong" w:hAnsi="FangSong" w:cs="Times New Roman"/>
-          <w:bCs/>
-          <w:snapToGrid w:val="0"/>
-          <w:kern w:val="24"/>
-          <w:sz w:val="28"/>
-          <w:szCs w:val="24"/>
-          <w:lang w:eastAsia="zh-CN"/>
-        </w:rPr>
-      </w:r>
-      <w:r>
-        <w:rPr>
-          <w:rFonts w:ascii="FangSong" w:eastAsia="FangSong" w:hAnsi="FangSong" w:cs="Times New Roman" w:hint="eastAsia"/>
-          <w:bCs/>
-          <w:snapToGrid w:val="0"/>
-          <w:kern w:val="24"/>
-          <w:sz w:val="28"/>
-          <w:szCs w:val="24"/>
-          <w:lang w:eastAsia="zh-CN"/>
-        </w:rPr>
-      </w:r>
-      <w:r>
-        <w:rPr>
-          <w:rFonts w:ascii="FangSong" w:eastAsia="FangSong" w:hAnsi="FangSong" w:cs="Times New Roman" w:hint="eastAsia"/>
-          <w:b/>
-          <w:bCs/>
-          <w:snapToGrid w:val="0"/>
-          <w:kern w:val="24"/>
-          <w:sz w:val="28"/>
-          <w:szCs w:val="24"/>
-          <w:lang w:eastAsia="zh-CN"/>
-        </w:rPr>
-      </w:r>
-      <w:r>
-        <w:rPr>
-          <w:rFonts w:ascii="FangSong" w:eastAsia="FangSong" w:hAnsi="FangSong" w:cs="Times New Roman" w:hint="eastAsia"/>
-          <w:b/>
-          <w:bCs/>
-          <w:snapToGrid w:val="0"/>
-          <w:kern w:val="24"/>
-          <w:sz w:val="28"/>
-          <w:szCs w:val="24"/>
-          <w:lang w:eastAsia="zh-CN"/>
-        </w:rPr>
-      </w:r>
-      <w:r>
-        <w:rPr>
-          <w:rFonts w:ascii="FangSong" w:eastAsia="FangSong" w:hAnsi="FangSong" w:cs="Times New Roman"/>
-          <w:b/>
-          <w:bCs/>
-          <w:snapToGrid w:val="0"/>
-          <w:kern w:val="24"/>
-          <w:sz w:val="28"/>
-          <w:szCs w:val="24"/>
-          <w:lang w:eastAsia="zh-CN"/>
-        </w:rPr>
-      </w:r>
-      <w:r>
-        <w:rPr>
-          <w:rFonts w:ascii="FangSong" w:eastAsia="FangSong" w:hAnsi="FangSong" w:cs="Times New Roman" w:hint="eastAsia"/>
-          <w:b/>
+        <w:t>后续关注：建议按同一口径持续跟踪派息政策、资本开支变化、AI/算力投入、5G用户渗透和资本市场反馈，避免仅看单一收入指标。</w:t>
+      </w:r>
+      <w:r>
+        <w:rPr>
+          <w:rFonts w:ascii="FangSong" w:eastAsia="FangSong" w:hAnsi="FangSong" w:cs="Times New Roman" w:hint="eastAsia"/>
+          <w:bCs/>
+          <w:snapToGrid w:val="0"/>
+          <w:kern w:val="24"/>
+          <w:sz w:val="28"/>
+          <w:szCs w:val="24"/>
+          <w:lang w:eastAsia="zh-CN"/>
+        </w:rPr>
+      </w:r>
+      <w:r>
+        <w:rPr>
+          <w:rFonts w:ascii="FangSong" w:eastAsia="FangSong" w:hAnsi="FangSong" w:cs="Times New Roman" w:hint="eastAsia"/>
+          <w:bCs/>
+          <w:snapToGrid w:val="0"/>
+          <w:kern w:val="24"/>
+          <w:sz w:val="28"/>
+          <w:szCs w:val="24"/>
+          <w:lang w:eastAsia="zh-CN"/>
+        </w:rPr>
+      </w:r>
+      <w:r>
+        <w:rPr>
+          <w:rFonts w:ascii="FangSong" w:eastAsia="FangSong" w:hAnsi="FangSong" w:cs="Times New Roman" w:hint="eastAsia"/>
+          <w:bCs/>
+          <w:snapToGrid w:val="0"/>
+          <w:kern w:val="24"/>
+          <w:sz w:val="28"/>
+          <w:szCs w:val="24"/>
+          <w:lang w:eastAsia="zh-CN"/>
+        </w:rPr>
+      </w:r>
+      <w:r>
+        <w:rPr>
+          <w:rFonts w:ascii="FangSong" w:eastAsia="FangSong" w:hAnsi="FangSong" w:cs="Times New Roman" w:hint="eastAsia"/>
+          <w:bCs/>
+          <w:snapToGrid w:val="0"/>
+          <w:kern w:val="24"/>
+          <w:sz w:val="28"/>
+          <w:szCs w:val="24"/>
+          <w:lang w:eastAsia="zh-CN"/>
+        </w:rPr>
+      </w:r>
+      <w:r>
+        <w:rPr>
+          <w:rFonts w:ascii="FangSong" w:eastAsia="FangSong" w:hAnsi="FangSong" w:cs="Times New Roman"/>
+          <w:bCs/>
+          <w:snapToGrid w:val="0"/>
+          <w:kern w:val="24"/>
+          <w:sz w:val="28"/>
+          <w:szCs w:val="24"/>
+          <w:lang w:eastAsia="zh-CN"/>
+        </w:rPr>
+      </w:r>
+      <w:r>
+        <w:rPr>
+          <w:rFonts w:ascii="FangSong" w:eastAsia="FangSong" w:hAnsi="FangSong" w:cs="Times New Roman" w:hint="eastAsia"/>
+          <w:bCs/>
+          <w:snapToGrid w:val="0"/>
+          <w:kern w:val="24"/>
+          <w:sz w:val="28"/>
+          <w:szCs w:val="24"/>
+          <w:lang w:eastAsia="zh-CN"/>
+        </w:rPr>
+      </w:r>
+      <w:r>
+        <w:rPr>
+          <w:rFonts w:ascii="FangSong" w:eastAsia="FangSong" w:hAnsi="FangSong" w:cs="Times New Roman" w:hint="eastAsia"/>
+          <w:bCs/>
+          <w:snapToGrid w:val="0"/>
+          <w:kern w:val="24"/>
+          <w:sz w:val="28"/>
+          <w:szCs w:val="24"/>
+          <w:lang w:eastAsia="zh-CN"/>
+        </w:rPr>
+      </w:r>
+      <w:r>
+        <w:rPr>
+          <w:rFonts w:ascii="FangSong" w:eastAsia="FangSong" w:hAnsi="FangSong" w:cs="Times New Roman"/>
+          <w:bCs/>
+          <w:snapToGrid w:val="0"/>
+          <w:kern w:val="24"/>
+          <w:sz w:val="28"/>
+          <w:szCs w:val="24"/>
+          <w:lang w:eastAsia="zh-CN"/>
+        </w:rPr>
+      </w:r>
+      <w:r>
+        <w:rPr>
+          <w:rFonts w:ascii="FangSong" w:eastAsia="FangSong" w:hAnsi="FangSong" w:cs="Times New Roman" w:hint="eastAsia"/>
+          <w:bCs/>
+          <w:snapToGrid w:val="0"/>
+          <w:kern w:val="24"/>
+          <w:sz w:val="28"/>
+          <w:szCs w:val="24"/>
+          <w:lang w:eastAsia="zh-CN"/>
+        </w:rPr>
+      </w:r>
+      <w:r>
+        <w:rPr>
+          <w:rFonts w:ascii="FangSong" w:eastAsia="FangSong" w:hAnsi="FangSong" w:cs="Times New Roman" w:hint="eastAsia"/>
+          <w:bCs/>
+          <w:snapToGrid w:val="0"/>
+          <w:kern w:val="24"/>
+          <w:sz w:val="28"/>
+          <w:szCs w:val="24"/>
+          <w:lang w:eastAsia="zh-CN"/>
+        </w:rPr>
+      </w:r>
+      <w:r>
+        <w:rPr>
+          <w:rFonts w:ascii="FangSong" w:eastAsia="FangSong" w:hAnsi="FangSong" w:cs="Times New Roman" w:hint="eastAsia"/>
+          <w:bCs/>
+          <w:snapToGrid w:val="0"/>
+          <w:kern w:val="24"/>
+          <w:sz w:val="28"/>
+          <w:szCs w:val="24"/>
+          <w:lang w:eastAsia="zh-CN"/>
+        </w:rPr>
+      </w:r>
+      <w:r>
+        <w:rPr>
+          <w:rFonts w:ascii="FangSong" w:eastAsia="FangSong" w:hAnsi="FangSong" w:cs="Times New Roman" w:hint="eastAsia"/>
+          <w:bCs/>
+          <w:snapToGrid w:val="0"/>
+          <w:kern w:val="24"/>
+          <w:sz w:val="28"/>
+          <w:szCs w:val="24"/>
+          <w:lang w:eastAsia="zh-CN"/>
+        </w:rPr>
+      </w:r>
+      <w:r>
+        <w:rPr>
+          <w:rFonts w:ascii="FangSong" w:eastAsia="FangSong" w:hAnsi="FangSong" w:cs="Times New Roman"/>
+          <w:bCs/>
+          <w:snapToGrid w:val="0"/>
+          <w:kern w:val="24"/>
+          <w:sz w:val="28"/>
+          <w:szCs w:val="24"/>
+          <w:lang w:eastAsia="zh-CN"/>
+        </w:rPr>
+      </w:r>
+      <w:r>
+        <w:rPr>
+          <w:rFonts w:ascii="FangSong" w:eastAsia="FangSong" w:hAnsi="FangSong" w:cs="Times New Roman" w:hint="eastAsia"/>
+          <w:bCs/>
+          <w:snapToGrid w:val="0"/>
+          <w:kern w:val="24"/>
+          <w:sz w:val="28"/>
+          <w:szCs w:val="24"/>
+          <w:lang w:eastAsia="zh-CN"/>
+        </w:rPr>
+      </w:r>
+      <w:r>
+        <w:rPr>
+          <w:rFonts w:ascii="FangSong" w:eastAsia="FangSong" w:hAnsi="FangSong" w:cs="Times New Roman" w:hint="eastAsia"/>
+          <w:bCs/>
+          <w:snapToGrid w:val="0"/>
+          <w:kern w:val="24"/>
+          <w:sz w:val="28"/>
+          <w:szCs w:val="24"/>
+          <w:lang w:eastAsia="zh-CN"/>
+        </w:rPr>
+      </w:r>
+      <w:r>
+        <w:rPr>
+          <w:rFonts w:ascii="FangSong" w:eastAsia="FangSong" w:hAnsi="FangSong" w:cs="Times New Roman"/>
+          <w:bCs/>
+          <w:snapToGrid w:val="0"/>
+          <w:kern w:val="24"/>
+          <w:sz w:val="28"/>
+          <w:szCs w:val="24"/>
+          <w:lang w:eastAsia="zh-CN"/>
+        </w:rPr>
+      </w:r>
+      <w:r>
+        <w:rPr>
+          <w:rFonts w:ascii="FangSong" w:eastAsia="FangSong" w:hAnsi="FangSong" w:cs="Times New Roman" w:hint="eastAsia"/>
+          <w:bCs/>
+          <w:snapToGrid w:val="0"/>
+          <w:kern w:val="24"/>
+          <w:sz w:val="28"/>
+          <w:szCs w:val="24"/>
+          <w:lang w:eastAsia="zh-CN"/>
+        </w:rPr>
+      </w:r>
+      <w:r>
+        <w:rPr>
+          <w:rFonts w:ascii="FangSong" w:eastAsia="FangSong" w:hAnsi="FangSong" w:cs="Times New Roman" w:hint="eastAsia"/>
+          <w:bCs/>
+          <w:snapToGrid w:val="0"/>
+          <w:kern w:val="24"/>
+          <w:sz w:val="28"/>
+          <w:szCs w:val="24"/>
+          <w:lang w:eastAsia="zh-CN"/>
+        </w:rPr>
+      </w:r>
+      <w:r>
+        <w:rPr>
+          <w:rFonts w:ascii="FangSong" w:eastAsia="FangSong" w:hAnsi="FangSong" w:cs="Times New Roman"/>
           <w:bCs/>
           <w:snapToGrid w:val="0"/>
           <w:kern w:val="24"/>

</xml_diff>